<commit_message>
Updating the content in the files to be more oriented .
</commit_message>
<xml_diff>
--- a/AgenticAI/AgenticAI.docx
+++ b/AgenticAI/AgenticAI.docx
@@ -148,29 +148,38 @@
         </w:rPr>
       </w:pPr>
       <w:r>
-        <w:t xml:space="preserve">The crisp interview definition: </w:t>
-      </w:r>
-      <w:r>
-        <w:rPr>
-          <w:b/>
-          <w:bCs/>
-        </w:rPr>
+        <w:rPr>
+          <w:b/>
+          <w:bCs/>
+        </w:rPr>
+        <w:t>The crisp definition</w:t>
+      </w:r>
+      <w:r>
+        <w:rPr>
+          <w:b/>
+          <w:bCs/>
+        </w:rPr>
+        <w:t xml:space="preserve"> for an agent</w:t>
+      </w:r>
+      <w:r>
+        <w:rPr>
+          <w:b/>
+          <w:bCs/>
+        </w:rPr>
+        <w:t>:</w:t>
+      </w:r>
+      <w:r>
+        <w:t xml:space="preserve"> </w:t>
+      </w:r>
+      <w:r>
         <w:t xml:space="preserve">An agent is an LLM that's given tools and a </w:t>
       </w:r>
       <w:proofErr w:type="gramStart"/>
       <w:r>
-        <w:rPr>
-          <w:b/>
-          <w:bCs/>
-        </w:rPr>
         <w:t>goal, and</w:t>
       </w:r>
       <w:proofErr w:type="gramEnd"/>
       <w:r>
-        <w:rPr>
-          <w:b/>
-          <w:bCs/>
-        </w:rPr>
         <w:t xml:space="preserve"> runs in a loop where it picks an action, observes the result, and decides the next action until the goal is met or it gives up.</w:t>
       </w:r>
     </w:p>
@@ -180,6 +189,23 @@
           <w:b/>
           <w:bCs/>
         </w:rPr>
+        <w:t>The crisp definition for agent</w:t>
+      </w:r>
+      <w:r>
+        <w:rPr>
+          <w:b/>
+          <w:bCs/>
+        </w:rPr>
+        <w:t>ic AI:</w:t>
+      </w:r>
+      <w:r>
+        <w:rPr>
+          <w:b/>
+          <w:bCs/>
+        </w:rPr>
+        <w:t xml:space="preserve"> </w:t>
+      </w:r>
+      <w:r>
         <w:t xml:space="preserve">Agentic AI refers to autonomous artificial intelligence systems designed to achieve complex, multi-step goals with minimal human supervision. </w:t>
       </w:r>
     </w:p>
@@ -200,7 +226,14 @@
     </w:p>
     <w:p>
       <w:r>
-        <w:t xml:space="preserve">Every agent — whether you build it on </w:t>
+        <w:rPr>
+          <w:b/>
+          <w:bCs/>
+        </w:rPr>
+        <w:t>Every agent</w:t>
+      </w:r>
+      <w:r>
+        <w:t xml:space="preserve"> — whether you build it on </w:t>
       </w:r>
       <w:proofErr w:type="spellStart"/>
       <w:r>
@@ -611,7 +644,14 @@
         </w:numPr>
       </w:pPr>
       <w:r>
-        <w:t xml:space="preserve">Supervisor / hierarchical: a router agent </w:t>
+        <w:rPr>
+          <w:b/>
+          <w:bCs/>
+        </w:rPr>
+        <w:t>Supervisor / hierarchical:</w:t>
+      </w:r>
+      <w:r>
+        <w:t xml:space="preserve"> a router agent </w:t>
       </w:r>
       <w:proofErr w:type="gramStart"/>
       <w:r>
@@ -630,7 +670,14 @@
         </w:numPr>
       </w:pPr>
       <w:r>
-        <w:t>Debate / dual: two agents argue, a judge picks the winner. Useful for high-stakes correctness.</w:t>
+        <w:rPr>
+          <w:b/>
+          <w:bCs/>
+        </w:rPr>
+        <w:t>Debate / dual:</w:t>
+      </w:r>
+      <w:r>
+        <w:t xml:space="preserve"> two agents argue, a judge picks the winner. Useful for high-stakes correctness.</w:t>
       </w:r>
     </w:p>
     <w:p>
@@ -641,7 +688,14 @@
         </w:numPr>
       </w:pPr>
       <w:r>
-        <w:t>Pipeline: agents in a fixed sequence (ingest → analyze → write → review).</w:t>
+        <w:rPr>
+          <w:b/>
+          <w:bCs/>
+        </w:rPr>
+        <w:t xml:space="preserve">Pipeline: </w:t>
+      </w:r>
+      <w:r>
+        <w:t>agents in a fixed sequence (ingest → analyze → write → review).</w:t>
       </w:r>
     </w:p>
     <w:p>
@@ -676,37 +730,24 @@
     </w:p>
     <w:p>
       <w:r>
-        <w:t xml:space="preserve">For the interview, the line </w:t>
-      </w:r>
-      <w:proofErr w:type="gramStart"/>
-      <w:r>
-        <w:t>that lands</w:t>
-      </w:r>
-      <w:proofErr w:type="gramEnd"/>
+        <w:rPr>
+          <w:b/>
+          <w:bCs/>
+        </w:rPr>
+        <w:t>Remember</w:t>
+      </w:r>
       <w:r>
         <w:t xml:space="preserve">: </w:t>
       </w:r>
       <w:r>
-        <w:rPr>
-          <w:b/>
-          <w:bCs/>
-        </w:rPr>
         <w:t xml:space="preserve">"Multi-agent isn't always better — it adds latency, cost, and failure modes. I default to a single </w:t>
       </w:r>
       <w:proofErr w:type="spellStart"/>
       <w:r>
-        <w:rPr>
-          <w:b/>
-          <w:bCs/>
-        </w:rPr>
         <w:t>ReAct</w:t>
       </w:r>
       <w:proofErr w:type="spellEnd"/>
       <w:r>
-        <w:rPr>
-          <w:b/>
-          <w:bCs/>
-        </w:rPr>
         <w:t xml:space="preserve"> or planner-executor agent and only split into specialists when there's a clear separation of concerns or a context-window reason."</w:t>
       </w:r>
     </w:p>
@@ -722,7 +763,7 @@
           <w:b/>
           <w:bCs/>
         </w:rPr>
-        <w:t>4. Agentic RAG (the version on your resume)</w:t>
+        <w:t>4. Agentic RAG</w:t>
       </w:r>
     </w:p>
     <w:p>
@@ -823,77 +864,84 @@
     </w:p>
     <w:p>
       <w:r>
-        <w:t xml:space="preserve">The architecture story (this is the version you can </w:t>
+        <w:rPr>
+          <w:b/>
+          <w:bCs/>
+        </w:rPr>
+        <w:t>The architecture story:</w:t>
+      </w:r>
+      <w:r>
+        <w:t xml:space="preserve"> </w:t>
+      </w:r>
+      <w:r>
+        <w:rPr>
+          <w:b/>
+          <w:bCs/>
+        </w:rPr>
+        <w:t>vector store + graph database + tool-using LLM agent + evaluator.</w:t>
+      </w:r>
+      <w:r>
+        <w:t xml:space="preserve"> The graph gives you relationship-grounded answers ("show me everything connected to this customer's account"); the vector store gives you semantic similarity; the agent picks which to use per query and cites both.</w:t>
+      </w:r>
+    </w:p>
+    <w:p>
+      <w:pPr>
+        <w:rPr>
+          <w:b/>
+          <w:bCs/>
+        </w:rPr>
+      </w:pPr>
+      <w:r>
+        <w:rPr>
+          <w:b/>
+          <w:bCs/>
+        </w:rPr>
+        <w:t>5. MCP (Model Context Protocol)</w:t>
+      </w:r>
+    </w:p>
+    <w:p>
+      <w:r>
+        <w:t>This is a 2024 Anthropic-led standard you'll likely be asked about, especially since the JD mentions Claude Code.</w:t>
+      </w:r>
+    </w:p>
+    <w:p>
+      <w:r>
+        <w:rPr>
+          <w:b/>
+          <w:bCs/>
+        </w:rPr>
+        <w:t>What it is:</w:t>
+      </w:r>
+      <w:r>
+        <w:t xml:space="preserve"> a protocol that lets any LLM client (Claude, Cursor, your own app) talk to any tool server in a standard way — like LSP for AI tools. </w:t>
       </w:r>
       <w:proofErr w:type="gramStart"/>
       <w:r>
-        <w:t>tell</w:t>
+        <w:t>A</w:t>
       </w:r>
       <w:proofErr w:type="gramEnd"/>
       <w:r>
-        <w:t xml:space="preserve"> about Capital One / EY): </w:t>
-      </w:r>
-      <w:r>
-        <w:rPr>
-          <w:b/>
-          <w:bCs/>
-        </w:rPr>
-        <w:t>vector store + graph database + tool-using LLM agent + evaluator.</w:t>
-      </w:r>
-      <w:r>
-        <w:t xml:space="preserve"> The graph gives you relationship-grounded answers ("show me everything connected to this customer's account"); the vector store gives you semantic similarity; the agent picks which to use per query and cites both.</w:t>
-      </w:r>
-    </w:p>
-    <w:p>
-      <w:pPr>
-        <w:rPr>
-          <w:b/>
-          <w:bCs/>
-        </w:rPr>
-      </w:pPr>
-      <w:r>
-        <w:rPr>
-          <w:b/>
-          <w:bCs/>
-        </w:rPr>
-        <w:t>5. MCP (Model Context Protocol)</w:t>
-      </w:r>
-    </w:p>
-    <w:p>
-      <w:r>
-        <w:t>This is a 2024 Anthropic-led standard you'll likely be asked about, especially since the JD mentions Claude Code.</w:t>
-      </w:r>
-    </w:p>
-    <w:p>
-      <w:r>
-        <w:rPr>
-          <w:b/>
-          <w:bCs/>
-        </w:rPr>
-        <w:t>What it is:</w:t>
-      </w:r>
-      <w:r>
-        <w:t xml:space="preserve"> a protocol that lets any LLM client (Claude, Cursor, your own app) talk to any tool server in a standard way — like LSP for AI tools. </w:t>
+        <w:t xml:space="preserve"> "MCP server" exposes resources (files, DB rows), tools (callable functions), and prompts (templates). The client discovers them dynamically.</w:t>
+      </w:r>
+    </w:p>
+    <w:p>
+      <w:r>
+        <w:rPr>
+          <w:b/>
+          <w:bCs/>
+        </w:rPr>
+        <w:t>Why it matters:</w:t>
+      </w:r>
+      <w:r>
+        <w:t xml:space="preserve"> instead of every </w:t>
       </w:r>
       <w:proofErr w:type="gramStart"/>
       <w:r>
-        <w:t>A</w:t>
+        <w:t>team building</w:t>
       </w:r>
       <w:proofErr w:type="gramEnd"/>
       <w:r>
-        <w:t xml:space="preserve"> "MCP server" exposes resources (files, DB rows), tools (callable functions), and prompts (templates). The client discovers them dynamically.</w:t>
-      </w:r>
-    </w:p>
-    <w:p>
-      <w:r>
-        <w:rPr>
-          <w:b/>
-          <w:bCs/>
-        </w:rPr>
-        <w:t>Why it matters for FDE work:</w:t>
-      </w:r>
-      <w:r>
-        <w:t xml:space="preserve"> instead of every team building bespoke tool integrations into their AI assistant, you stand up MCP servers once (e.g., a Jira MCP server, a GitHub MCP server, an internal-API MCP server) and any AI tool — Cursor, Claude Code, your custom agent — can use them. It's the modernization-factory equivalent of a </w:t>
+        <w:t xml:space="preserve"> bespoke tool integrations into their AI assistant, you stand up MCP servers once (e.g., a Jira MCP server, a GitHub MCP server, an internal-API MCP server) and any AI tool — Cursor, Claude Code, your custom agent — can use them. It's the modernization-factory equivalent of a </w:t>
       </w:r>
       <w:proofErr w:type="gramStart"/>
       <w:r>
@@ -906,29 +954,26 @@
     </w:p>
     <w:p>
       <w:r>
-        <w:t xml:space="preserve">The concise pitch: </w:t>
-      </w:r>
-      <w:r>
-        <w:rPr>
-          <w:b/>
-          <w:bCs/>
-        </w:rPr>
-        <w:t>"MCP is to AI tools what USB-C is to peripherals — one protocol, plug anything into anything."</w:t>
-      </w:r>
-    </w:p>
-    <w:p>
-      <w:pPr>
-        <w:rPr>
-          <w:b/>
-          <w:bCs/>
-        </w:rPr>
-      </w:pPr>
-      <w:r>
-        <w:rPr>
-          <w:b/>
-          <w:bCs/>
-        </w:rPr>
-        <w:t>6. Frameworks you should be conversant with</w:t>
+        <w:rPr>
+          <w:b/>
+          <w:bCs/>
+        </w:rPr>
+        <w:t>MCP is to AI tools what USB-C is to peripherals — one protocol, plug anything into anything.</w:t>
+      </w:r>
+    </w:p>
+    <w:p>
+      <w:pPr>
+        <w:rPr>
+          <w:b/>
+          <w:bCs/>
+        </w:rPr>
+      </w:pPr>
+      <w:r>
+        <w:rPr>
+          <w:b/>
+          <w:bCs/>
+        </w:rPr>
+        <w:t>6. Frameworks</w:t>
       </w:r>
     </w:p>
     <w:p>
@@ -1056,98 +1101,6 @@
       </w:r>
     </w:p>
     <w:p>
-      <w:r>
-        <w:t xml:space="preserve">For the interview, the honest answer is: </w:t>
-      </w:r>
-      <w:r>
-        <w:rPr>
-          <w:b/>
-          <w:bCs/>
-        </w:rPr>
-        <w:t xml:space="preserve">"For greenfield work I lean toward </w:t>
-      </w:r>
-      <w:proofErr w:type="spellStart"/>
-      <w:r>
-        <w:rPr>
-          <w:b/>
-          <w:bCs/>
-        </w:rPr>
-        <w:t>LangGraph</w:t>
-      </w:r>
-      <w:proofErr w:type="spellEnd"/>
-      <w:r>
-        <w:rPr>
-          <w:b/>
-          <w:bCs/>
-        </w:rPr>
-        <w:t xml:space="preserve"> or raw provider tool use because the control flow stays explicit. </w:t>
-      </w:r>
-      <w:proofErr w:type="spellStart"/>
-      <w:r>
-        <w:rPr>
-          <w:b/>
-          <w:bCs/>
-        </w:rPr>
-        <w:t>AutoGen</w:t>
-      </w:r>
-      <w:proofErr w:type="spellEnd"/>
-      <w:r>
-        <w:rPr>
-          <w:b/>
-          <w:bCs/>
-        </w:rPr>
-        <w:t xml:space="preserve"> and </w:t>
-      </w:r>
-      <w:proofErr w:type="spellStart"/>
-      <w:r>
-        <w:rPr>
-          <w:b/>
-          <w:bCs/>
-        </w:rPr>
-        <w:t>CrewAI</w:t>
-      </w:r>
-      <w:proofErr w:type="spellEnd"/>
-      <w:r>
-        <w:rPr>
-          <w:b/>
-          <w:bCs/>
-        </w:rPr>
-        <w:t xml:space="preserve"> are great for prototyping multi-agent </w:t>
-      </w:r>
-      <w:proofErr w:type="gramStart"/>
-      <w:r>
-        <w:rPr>
-          <w:b/>
-          <w:bCs/>
-        </w:rPr>
-        <w:t>ideas</w:t>
-      </w:r>
-      <w:proofErr w:type="gramEnd"/>
-      <w:r>
-        <w:rPr>
-          <w:b/>
-          <w:bCs/>
-        </w:rPr>
-        <w:t xml:space="preserve"> but I want my orchestrator to be </w:t>
-      </w:r>
-      <w:proofErr w:type="spellStart"/>
-      <w:r>
-        <w:rPr>
-          <w:b/>
-          <w:bCs/>
-        </w:rPr>
-        <w:t>debuggable</w:t>
-      </w:r>
-      <w:proofErr w:type="spellEnd"/>
-      <w:r>
-        <w:rPr>
-          <w:b/>
-          <w:bCs/>
-        </w:rPr>
-        <w:t xml:space="preserve"> in production."</w:t>
-      </w:r>
-    </w:p>
-    <w:p>
       <w:pPr>
         <w:rPr>
           <w:b/>
@@ -1160,11 +1113,6 @@
           <w:bCs/>
         </w:rPr>
         <w:t>7. AI-assisted SDLC: Cursor, Claude Code, and what makes them "agentic"</w:t>
-      </w:r>
-    </w:p>
-    <w:p>
-      <w:r>
-        <w:t>This is the JD's emphasis — make sure you can speak to it crisply.</w:t>
       </w:r>
     </w:p>
     <w:p>
@@ -1239,15 +1187,15 @@
     </w:p>
     <w:p>
       <w:r>
-        <w:t xml:space="preserve">What an FDE </w:t>
+        <w:t xml:space="preserve">What these tools </w:t>
       </w:r>
       <w:proofErr w:type="gramStart"/>
       <w:r>
-        <w:t>actually does</w:t>
+        <w:t>does</w:t>
       </w:r>
       <w:proofErr w:type="gramEnd"/>
       <w:r>
-        <w:t xml:space="preserve"> with these tools (and what you should claim to have done):</w:t>
+        <w:t>:</w:t>
       </w:r>
     </w:p>
     <w:p>
@@ -1312,7 +1260,6 @@
         </w:numPr>
       </w:pPr>
       <w:r>
-        <w:lastRenderedPageBreak/>
         <w:t xml:space="preserve">Set up </w:t>
       </w:r>
       <w:r>
@@ -1370,42 +1317,23 @@
     </w:p>
     <w:p>
       <w:r>
-        <w:t xml:space="preserve">The killer line for the interview: </w:t>
-      </w:r>
-      <w:r>
-        <w:rPr>
-          <w:b/>
-          <w:bCs/>
-        </w:rPr>
-        <w:t>"AI-assisted SDLC isn't about the tool, it's about the workflow. Cursor and Claude Code are commodity capabilities now; the FDE value is in choosing what to automate, building the prompt and tool scaffolding for the team, and managing the human side of trust and adoption."</w:t>
-      </w:r>
-    </w:p>
-    <w:p>
-      <w:pPr>
-        <w:rPr>
-          <w:b/>
-          <w:bCs/>
-        </w:rPr>
-      </w:pPr>
-      <w:r>
-        <w:rPr>
-          <w:b/>
-          <w:bCs/>
-        </w:rPr>
-        <w:t>8. Production considerations (the part that separates senior from junior)</w:t>
-      </w:r>
-    </w:p>
-    <w:p>
-      <w:r>
-        <w:t xml:space="preserve">Interviewers love this section because it shows you've </w:t>
-      </w:r>
-      <w:proofErr w:type="gramStart"/>
-      <w:r>
-        <w:t>actually shipped</w:t>
-      </w:r>
-      <w:proofErr w:type="gramEnd"/>
-      <w:r>
-        <w:t xml:space="preserve"> agents.</w:t>
+        <w:lastRenderedPageBreak/>
+        <w:t>AI-assisted SDLC isn't about the tool, it's about the workflow. Cursor and Claude Code are commodity capabilities now; the value is in choosing what to automate, building the prompt and tool scaffolding for the team, and managing the human side of trust and adoption.</w:t>
+      </w:r>
+    </w:p>
+    <w:p>
+      <w:pPr>
+        <w:rPr>
+          <w:b/>
+          <w:bCs/>
+        </w:rPr>
+      </w:pPr>
+      <w:r>
+        <w:rPr>
+          <w:b/>
+          <w:bCs/>
+        </w:rPr>
+        <w:t>8. Production considerations</w:t>
       </w:r>
     </w:p>
     <w:p>
@@ -1618,51 +1546,50 @@
           <w:b/>
           <w:bCs/>
         </w:rPr>
+        <w:t>Safety &amp; governance</w:t>
+      </w:r>
+      <w:r>
+        <w:t xml:space="preserve"> — for regulated environments (your Capital One / EY story), this means: full audit trails of every prompt, tool call, and output; data residency on retrieval; RBAC on tools; signed/approved tools only; human-in-the-loop for high-stakes actions.</w:t>
+      </w:r>
+    </w:p>
+    <w:p>
+      <w:r>
+        <w:rPr>
+          <w:b/>
+          <w:bCs/>
+        </w:rPr>
+        <w:t>Failure modes to acknowledge</w:t>
+      </w:r>
+      <w:r>
+        <w:t xml:space="preserve"> — hallucinated tool calls, infinite loops, context-window exhaustion, conflicting agents in multi-agent setups, data leakage via tool outputs. Senior engineers can name these unprompted.</w:t>
+      </w:r>
+    </w:p>
+    <w:p>
+      <w:r>
+        <w:rPr>
+          <w:b/>
+          <w:bCs/>
+        </w:rPr>
+        <w:t xml:space="preserve">9. </w:t>
+      </w:r>
+      <w:r>
+        <w:rPr>
+          <w:b/>
+          <w:bCs/>
+        </w:rPr>
+        <w:t>Five anchor points</w:t>
+      </w:r>
+      <w:r>
+        <w:t>:</w:t>
+      </w:r>
+    </w:p>
+    <w:p>
+      <w:r>
+        <w:rPr>
+          <w:b/>
+          <w:bCs/>
+        </w:rPr>
         <w:lastRenderedPageBreak/>
-        <w:t>Safety &amp; governance</w:t>
-      </w:r>
-      <w:r>
-        <w:t xml:space="preserve"> — for regulated environments (your Capital One / EY story), this means: full audit trails of every prompt, tool call, and output; data residency on retrieval; RBAC on tools; signed/approved tools only; human-in-the-loop for high-stakes actions.</w:t>
-      </w:r>
-    </w:p>
-    <w:p>
-      <w:r>
-        <w:rPr>
-          <w:b/>
-          <w:bCs/>
-        </w:rPr>
-        <w:t>Failure modes to acknowledge</w:t>
-      </w:r>
-      <w:r>
-        <w:t xml:space="preserve"> — hallucinated tool calls, infinite loops, context-window exhaustion, conflicting agents in multi-agent setups, data leakage via tool outputs. Senior engineers can name these unprompted.</w:t>
-      </w:r>
-    </w:p>
-    <w:p>
-      <w:pPr>
-        <w:rPr>
-          <w:b/>
-          <w:bCs/>
-        </w:rPr>
-      </w:pPr>
-      <w:r>
-        <w:rPr>
-          <w:b/>
-          <w:bCs/>
-        </w:rPr>
-        <w:t>9. How to connect this to the JD in your own words</w:t>
-      </w:r>
-    </w:p>
-    <w:p>
-      <w:r>
-        <w:t>Five anchor points to weave into stories during the interview:</w:t>
-      </w:r>
-    </w:p>
-    <w:p>
-      <w:r>
-        <w:rPr>
-          <w:b/>
-          <w:bCs/>
-        </w:rPr>
         <w:t>On modernization velocity</w:t>
       </w:r>
       <w:r>
@@ -1758,22 +1685,54 @@
         <w:t>On feedback loop to the central factory</w:t>
       </w:r>
       <w:r>
-        <w:t xml:space="preserve"> — "The FDE is the listening post. Every tool gap, every weird failure, every place the playbook didn't fit — those go back to the central architects so the next embed starts from a stronger baseline. The factory only works if the FDEs are honest about what isn't working yet."</w:t>
-      </w:r>
-    </w:p>
-    <w:p>
-      <w:pPr>
-        <w:rPr>
-          <w:b/>
-          <w:bCs/>
-        </w:rPr>
-      </w:pPr>
-      <w:r>
-        <w:rPr>
-          <w:b/>
-          <w:bCs/>
-        </w:rPr>
-        <w:t>10. Quick-fire definitions for rapid-fire round</w:t>
+        <w:t xml:space="preserve"> — "</w:t>
+      </w:r>
+      <w:r>
+        <w:t>In every team there</w:t>
+      </w:r>
+      <w:r>
+        <w:t xml:space="preserve"> is</w:t>
+      </w:r>
+      <w:r>
+        <w:t>/are</w:t>
+      </w:r>
+      <w:r>
+        <w:t xml:space="preserve"> </w:t>
+      </w:r>
+      <w:proofErr w:type="gramStart"/>
+      <w:r>
+        <w:t>listening</w:t>
+      </w:r>
+      <w:proofErr w:type="gramEnd"/>
+      <w:r>
+        <w:t xml:space="preserve"> post</w:t>
+      </w:r>
+      <w:r>
+        <w:t>s</w:t>
+      </w:r>
+      <w:r>
+        <w:t xml:space="preserve">. Every tool gap, every weird failure, every place the playbook didn't fit — those go back to the central architects so the next embed starts from a stronger baseline. The factory only works if the </w:t>
+      </w:r>
+      <w:r>
+        <w:t>team is</w:t>
+      </w:r>
+      <w:r>
+        <w:t xml:space="preserve"> honest about what isn't working yet."</w:t>
+      </w:r>
+    </w:p>
+    <w:p>
+      <w:pPr>
+        <w:rPr>
+          <w:b/>
+          <w:bCs/>
+        </w:rPr>
+      </w:pPr>
+      <w:r>
+        <w:rPr>
+          <w:b/>
+          <w:bCs/>
+        </w:rPr>
+        <w:t>10. Quick-fire definitions</w:t>
       </w:r>
     </w:p>
     <w:p>
@@ -1842,7 +1801,6 @@
           <w:b/>
           <w:bCs/>
         </w:rPr>
-        <w:lastRenderedPageBreak/>
         <w:t>Chunking</w:t>
       </w:r>
       <w:r>
@@ -1923,6 +1881,7 @@
           <w:b/>
           <w:bCs/>
         </w:rPr>
+        <w:lastRenderedPageBreak/>
         <w:t>Eval</w:t>
       </w:r>
       <w:r>

</xml_diff>